<commit_message>
Update SRS and SAD to the final reviewed versions and add PDF copies
</commit_message>
<xml_diff>
--- a/Project-Deliverables/Online_Quiz_System_SAD_Revised.docx
+++ b/Project-Deliverables/Online_Quiz_System_SAD_Revised.docx
@@ -19,7 +19,7 @@
     </w:p>
     <w:p>
       <w:pPr>
-        <w:pStyle w:val="Heading1"/>
+        <w:pStyle w:val="HeadingNoTOC"/>
         <w:jc w:val="center"/>
       </w:pPr>
       <w:r>
@@ -326,7 +326,7 @@
     </w:p>
     <w:p>
       <w:pPr>
-        <w:pStyle w:val="Heading1"/>
+        <w:pStyle w:val="HeadingNoTOC"/>
       </w:pPr>
       <w:r>
         <w:t>Document Control</w:t>
@@ -652,33 +652,172 @@
       </w:r>
     </w:p>
     <w:p>
+      <w:pPr>
+        <w:pStyle w:val="TOC1"/>
+        <w:tabs>
+          <w:tab w:val="right" w:leader="dot" w:pos="9782"/>
+        </w:tabs>
+      </w:pPr>
       <w:r>
-        <w:t>1. Introduction</w:t>
+        <w:fldChar w:fldCharType="begin"/>
       </w:r>
+      <w:r>
+        <w:instrText xml:space="preserve"> TOC \o "1-1" \h \z \u </w:instrText>
+      </w:r>
+      <w:r>
+        <w:fldChar w:fldCharType="separate"/>
+      </w:r>
+      <w:hyperlink w:anchor="_Toc8100" w:history="1">
+        <w:r>
+          <w:t xml:space="preserve">1. Introduction</w:t>
+        </w:r>
+        <w:r>
+          <w:tab/>
+        </w:r>
+        <w:r>
+          <w:fldChar w:fldCharType="begin"/>
+        </w:r>
+        <w:r>
+          <w:instrText xml:space="preserve"> PAGEREF _Toc8100 \h </w:instrText>
+        </w:r>
+        <w:r>
+          <w:fldChar w:fldCharType="separate"/>
+        </w:r>
+        <w:r>
+          <w:t>3</w:t>
+        </w:r>
+        <w:r>
+          <w:fldChar w:fldCharType="end"/>
+        </w:r>
+      </w:hyperlink>
+    </w:p>
+    <w:p>
+      <w:pPr>
+        <w:pStyle w:val="TOC1"/>
+        <w:tabs>
+          <w:tab w:val="right" w:leader="dot" w:pos="9782"/>
+        </w:tabs>
+      </w:pPr>
+      <w:hyperlink w:anchor="_Toc8101" w:history="1">
+        <w:r>
+          <w:t xml:space="preserve">2. Document Overview</w:t>
+        </w:r>
+        <w:r>
+          <w:tab/>
+        </w:r>
+        <w:r>
+          <w:fldChar w:fldCharType="begin"/>
+        </w:r>
+        <w:r>
+          <w:instrText xml:space="preserve"> PAGEREF _Toc8101 \h </w:instrText>
+        </w:r>
+        <w:r>
+          <w:fldChar w:fldCharType="separate"/>
+        </w:r>
+        <w:r>
+          <w:t>3</w:t>
+        </w:r>
+        <w:r>
+          <w:fldChar w:fldCharType="end"/>
+        </w:r>
+      </w:hyperlink>
+    </w:p>
+    <w:p>
+      <w:pPr>
+        <w:pStyle w:val="TOC1"/>
+        <w:tabs>
+          <w:tab w:val="right" w:leader="dot" w:pos="9782"/>
+        </w:tabs>
+      </w:pPr>
+      <w:hyperlink w:anchor="_Toc8102" w:history="1">
+        <w:r>
+          <w:t xml:space="preserve">3. Architecture</w:t>
+        </w:r>
+        <w:r>
+          <w:tab/>
+        </w:r>
+        <w:r>
+          <w:fldChar w:fldCharType="begin"/>
+        </w:r>
+        <w:r>
+          <w:instrText xml:space="preserve"> PAGEREF _Toc8102 \h </w:instrText>
+        </w:r>
+        <w:r>
+          <w:fldChar w:fldCharType="separate"/>
+        </w:r>
+        <w:r>
+          <w:t>4</w:t>
+        </w:r>
+        <w:r>
+          <w:fldChar w:fldCharType="end"/>
+        </w:r>
+      </w:hyperlink>
+    </w:p>
+    <w:p>
+      <w:pPr>
+        <w:pStyle w:val="TOC1"/>
+        <w:tabs>
+          <w:tab w:val="right" w:leader="dot" w:pos="9782"/>
+        </w:tabs>
+      </w:pPr>
+      <w:hyperlink w:anchor="_Toc8103" w:history="1">
+        <w:r>
+          <w:t xml:space="preserve">4. Design</w:t>
+        </w:r>
+        <w:r>
+          <w:tab/>
+        </w:r>
+        <w:r>
+          <w:fldChar w:fldCharType="begin"/>
+        </w:r>
+        <w:r>
+          <w:instrText xml:space="preserve"> PAGEREF _Toc8103 \h </w:instrText>
+        </w:r>
+        <w:r>
+          <w:fldChar w:fldCharType="separate"/>
+        </w:r>
+        <w:r>
+          <w:t>6</w:t>
+        </w:r>
+        <w:r>
+          <w:fldChar w:fldCharType="end"/>
+        </w:r>
+      </w:hyperlink>
+    </w:p>
+    <w:p>
+      <w:pPr>
+        <w:pStyle w:val="TOC1"/>
+        <w:tabs>
+          <w:tab w:val="right" w:leader="dot" w:pos="9782"/>
+        </w:tabs>
+      </w:pPr>
+      <w:hyperlink w:anchor="_Toc8104" w:history="1">
+        <w:r>
+          <w:t xml:space="preserve">5. Appendices</w:t>
+        </w:r>
+        <w:r>
+          <w:tab/>
+        </w:r>
+        <w:r>
+          <w:fldChar w:fldCharType="begin"/>
+        </w:r>
+        <w:r>
+          <w:instrText xml:space="preserve"> PAGEREF _Toc8104 \h </w:instrText>
+        </w:r>
+        <w:r>
+          <w:fldChar w:fldCharType="separate"/>
+        </w:r>
+        <w:r>
+          <w:t>11</w:t>
+        </w:r>
+        <w:r>
+          <w:fldChar w:fldCharType="end"/>
+        </w:r>
+      </w:hyperlink>
     </w:p>
     <w:p>
       <w:r>
-        <w:t>2. Document Overview</w:t>
-      </w:r>
-    </w:p>
-    <w:p>
-      <w:r>
-        <w:t>3. Architecture</w:t>
-      </w:r>
-    </w:p>
-    <w:p>
-      <w:r>
-        <w:t>4. Design</w:t>
-      </w:r>
-    </w:p>
-    <w:p>
-      <w:r>
-        <w:t>5. Appendices</w:t>
-      </w:r>
-    </w:p>
-    <w:p>
-      <w:r>
-        <w:t>Update the contents and page numbers in Word after final edits.</w:t>
+        <w:fldChar w:fldCharType="end"/>
       </w:r>
     </w:p>
     <w:p>
@@ -690,9 +829,11 @@
       <w:pPr>
         <w:pStyle w:val="Heading1"/>
       </w:pPr>
+      <w:bookmarkStart w:id="500" w:name="_Toc8100"/>
       <w:r>
         <w:t>1. Introduction</w:t>
       </w:r>
+      <w:bookmarkEnd w:id="500"/>
     </w:p>
     <w:p>
       <w:pPr>
@@ -1062,9 +1203,11 @@
       <w:pPr>
         <w:pStyle w:val="Heading1"/>
       </w:pPr>
+      <w:bookmarkStart w:id="501" w:name="_Toc8101"/>
       <w:r>
         <w:t>2. Document Overview</w:t>
       </w:r>
+      <w:bookmarkEnd w:id="501"/>
     </w:p>
     <w:p>
       <w:pPr>
@@ -1243,9 +1386,11 @@
       <w:pPr>
         <w:pStyle w:val="Heading1"/>
       </w:pPr>
+      <w:bookmarkStart w:id="502" w:name="_Toc8102"/>
       <w:r>
         <w:t>3. Architecture</w:t>
       </w:r>
+      <w:bookmarkEnd w:id="502"/>
     </w:p>
     <w:p>
       <w:pPr>
@@ -3636,6 +3781,156 @@
               <w:rPr>
                 <w:sz w:val="16"/>
               </w:rPr>
+              <w:t xml:space="preserve">NFR-001</w:t>
+            </w:r>
+          </w:p>
+        </w:tc>
+        <w:tc>
+          <w:tcPr>
+            <w:tcW w:type="dxa" w:w="3312"/>
+          </w:tcPr>
+          <w:p>
+            <w:pPr>
+              <w:spacing w:after="20"/>
+            </w:pPr>
+            <w:r>
+              <w:rPr>
+                <w:sz w:val="16"/>
+              </w:rPr>
+              <w:t xml:space="preserve">Express API / MongoDB</w:t>
+            </w:r>
+          </w:p>
+        </w:tc>
+        <w:tc>
+          <w:tcPr>
+            <w:tcW w:type="dxa" w:w="3312"/>
+          </w:tcPr>
+          <w:p>
+            <w:pPr>
+              <w:spacing w:after="20"/>
+            </w:pPr>
+            <w:r>
+              <w:rPr>
+                <w:sz w:val="16"/>
+              </w:rPr>
+              <w:t xml:space="preserve">Indexes on quizId and (userId, quizId); compact student DTOs; load test TC-PERF-01 in STP</w:t>
+            </w:r>
+          </w:p>
+        </w:tc>
+      </w:tr>
+      <w:tr>
+        <w:tc>
+          <w:tcPr>
+            <w:tcW w:type="dxa" w:w="3312"/>
+          </w:tcPr>
+          <w:p>
+            <w:pPr>
+              <w:spacing w:after="20"/>
+            </w:pPr>
+            <w:r>
+              <w:rPr>
+                <w:sz w:val="16"/>
+              </w:rPr>
+              <w:t xml:space="preserve">NFR-004–005</w:t>
+            </w:r>
+          </w:p>
+        </w:tc>
+        <w:tc>
+          <w:tcPr>
+            <w:tcW w:type="dxa" w:w="3312"/>
+          </w:tcPr>
+          <w:p>
+            <w:pPr>
+              <w:spacing w:after="20"/>
+            </w:pPr>
+            <w:r>
+              <w:rPr>
+                <w:sz w:val="16"/>
+              </w:rPr>
+              <w:t xml:space="preserve">React frontend</w:t>
+            </w:r>
+          </w:p>
+        </w:tc>
+        <w:tc>
+          <w:tcPr>
+            <w:tcW w:type="dxa" w:w="3312"/>
+          </w:tcPr>
+          <w:p>
+            <w:pPr>
+              <w:spacing w:after="20"/>
+            </w:pPr>
+            <w:r>
+              <w:rPr>
+                <w:sz w:val="16"/>
+              </w:rPr>
+              <w:t xml:space="preserve">Responsive layouts from 375 px; labelled forms with inline validation messages (Section 4.6)</w:t>
+            </w:r>
+          </w:p>
+        </w:tc>
+      </w:tr>
+      <w:tr>
+        <w:tc>
+          <w:tcPr>
+            <w:tcW w:type="dxa" w:w="3312"/>
+          </w:tcPr>
+          <w:p>
+            <w:pPr>
+              <w:spacing w:after="20"/>
+            </w:pPr>
+            <w:r>
+              <w:rPr>
+                <w:sz w:val="16"/>
+              </w:rPr>
+              <w:t xml:space="preserve">SEC-004–005</w:t>
+            </w:r>
+          </w:p>
+        </w:tc>
+        <w:tc>
+          <w:tcPr>
+            <w:tcW w:type="dxa" w:w="3312"/>
+          </w:tcPr>
+          <w:p>
+            <w:pPr>
+              <w:spacing w:after="20"/>
+            </w:pPr>
+            <w:r>
+              <w:rPr>
+                <w:sz w:val="16"/>
+              </w:rPr>
+              <w:t xml:space="preserve">API middleware / configuration</w:t>
+            </w:r>
+          </w:p>
+        </w:tc>
+        <w:tc>
+          <w:tcPr>
+            <w:tcW w:type="dxa" w:w="3312"/>
+          </w:tcPr>
+          <w:p>
+            <w:pPr>
+              <w:spacing w:after="20"/>
+            </w:pPr>
+            <w:r>
+              <w:rPr>
+                <w:sz w:val="16"/>
+              </w:rPr>
+              <w:t xml:space="preserve">Request validation middleware; secrets from environment variables, .env not committed (Section 3.9)</w:t>
+            </w:r>
+          </w:p>
+        </w:tc>
+      </w:tr>
+      <w:tr>
+        <w:tc>
+          <w:tcPr>
+            <w:tcW w:type="dxa" w:w="3312"/>
+          </w:tcPr>
+          <w:p>
+            <w:pPr>
+              <w:spacing w:after="20"/>
+            </w:pPr>
+            <w:r>
+              <w:rPr>
+                <w:sz w:val="16"/>
+              </w:rPr>
               <w:t>FR-027–031; NFR-006–007; SEC-006</w:t>
             </w:r>
           </w:p>
@@ -3979,9 +4274,11 @@
       <w:pPr>
         <w:pStyle w:val="Heading1"/>
       </w:pPr>
+      <w:bookmarkStart w:id="503" w:name="_Toc8103"/>
       <w:r>
         <w:t>4. Design</w:t>
       </w:r>
+      <w:bookmarkEnd w:id="503"/>
     </w:p>
     <w:p>
       <w:pPr>
@@ -4137,7 +4434,7 @@
               <w:rPr>
                 <w:sz w:val="16"/>
               </w:rPr>
-              <w:t>3</w:t>
+              <w:t xml:space="preserve">3</w:t>
             </w:r>
           </w:p>
         </w:tc>
@@ -4153,7 +4450,7 @@
               <w:rPr>
                 <w:sz w:val="16"/>
               </w:rPr>
-              <w:t>Student starts; API checks prior finalized attempts and stores start time/deadline.</w:t>
+              <w:t xml:space="preserve">Student starts; API returns the student's active attempt or creates one with start time/deadline; a finalized attempt is rejected (409).</w:t>
             </w:r>
           </w:p>
         </w:tc>
@@ -4667,7 +4964,7 @@
     </w:p>
     <w:p>
       <w:r>
-        <w:t>The following REST contracts define the proposed API baseline. Update the route names and schemas if the implemented Express router differs.</w:t>
+        <w:t xml:space="preserve">The following REST contracts define the proposed API baseline. Any route or schema change made during implementation will be reflected in this table and in the README API documentation.</w:t>
       </w:r>
     </w:p>
     <w:tbl>
@@ -4844,7 +5141,7 @@
               <w:rPr>
                 <w:sz w:val="16"/>
               </w:rPr>
-              <w:t>GET /api/quizzes</w:t>
+              <w:t xml:space="preserve">POST /api/auth/logout</w:t>
             </w:r>
           </w:p>
         </w:tc>
@@ -4860,7 +5157,7 @@
               <w:rPr>
                 <w:sz w:val="16"/>
               </w:rPr>
-              <w:t>Student</w:t>
+              <w:t xml:space="preserve">Authenticated user</w:t>
             </w:r>
           </w:p>
         </w:tc>
@@ -4876,7 +5173,7 @@
               <w:rPr>
                 <w:sz w:val="16"/>
               </w:rPr>
-              <w:t>List published quizzes and metadata only</w:t>
+              <w:t xml:space="preserve">Invalidate the caller's session so the logged-out token is rejected afterwards (FR-003)</w:t>
             </w:r>
           </w:p>
         </w:tc>
@@ -4894,7 +5191,7 @@
               <w:rPr>
                 <w:sz w:val="16"/>
               </w:rPr>
-              <w:t>GET /api/quizzes/:quizId</w:t>
+              <w:t>GET /api/quizzes</w:t>
             </w:r>
           </w:p>
         </w:tc>
@@ -4926,7 +5223,7 @@
               <w:rPr>
                 <w:sz w:val="16"/>
               </w:rPr>
-              <w:t>Quiz detail without answer keys/explanations</w:t>
+              <w:t>List published quizzes and metadata only</w:t>
             </w:r>
           </w:p>
         </w:tc>
@@ -4944,7 +5241,7 @@
               <w:rPr>
                 <w:sz w:val="16"/>
               </w:rPr>
-              <w:t>POST /api/quizzes</w:t>
+              <w:t>GET /api/quizzes/:quizId</w:t>
             </w:r>
           </w:p>
         </w:tc>
@@ -4960,7 +5257,7 @@
               <w:rPr>
                 <w:sz w:val="16"/>
               </w:rPr>
-              <w:t>Faculty/admin</w:t>
+              <w:t>Student</w:t>
             </w:r>
           </w:p>
         </w:tc>
@@ -4976,7 +5273,7 @@
               <w:rPr>
                 <w:sz w:val="16"/>
               </w:rPr>
-              <w:t>Create draft quiz</w:t>
+              <w:t>Quiz detail without answer keys/explanations</w:t>
             </w:r>
           </w:p>
         </w:tc>
@@ -4994,7 +5291,7 @@
               <w:rPr>
                 <w:sz w:val="16"/>
               </w:rPr>
-              <w:t>PATCH /api/quizzes/:quizId</w:t>
+              <w:t xml:space="preserve">GET /api/manage/quizzes</w:t>
             </w:r>
           </w:p>
         </w:tc>
@@ -5010,7 +5307,7 @@
               <w:rPr>
                 <w:sz w:val="16"/>
               </w:rPr>
-              <w:t>Authorized faculty/admin</w:t>
+              <w:t xml:space="preserve">Faculty/admin</w:t>
             </w:r>
           </w:p>
         </w:tc>
@@ -5026,7 +5323,7 @@
               <w:rPr>
                 <w:sz w:val="16"/>
               </w:rPr>
-              <w:t>Edit quiz subject to ownership policy</w:t>
+              <w:t xml:space="preserve">List quizzes the caller may manage, including drafts</w:t>
             </w:r>
           </w:p>
         </w:tc>
@@ -5044,7 +5341,7 @@
               <w:rPr>
                 <w:sz w:val="16"/>
               </w:rPr>
-              <w:t>POST /api/quizzes/:quizId/publish</w:t>
+              <w:t>POST /api/quizzes</w:t>
             </w:r>
           </w:p>
         </w:tc>
@@ -5076,7 +5373,7 @@
               <w:rPr>
                 <w:sz w:val="16"/>
               </w:rPr>
-              <w:t>Validate and publish complete quiz</w:t>
+              <w:t>Create draft quiz</w:t>
             </w:r>
           </w:p>
         </w:tc>
@@ -5094,7 +5391,7 @@
               <w:rPr>
                 <w:sz w:val="16"/>
               </w:rPr>
-              <w:t>POST /api/quizzes/:quizId/attempts</w:t>
+              <w:t>PATCH /api/quizzes/:quizId</w:t>
             </w:r>
           </w:p>
         </w:tc>
@@ -5110,7 +5407,7 @@
               <w:rPr>
                 <w:sz w:val="16"/>
               </w:rPr>
-              <w:t>Student</w:t>
+              <w:t>Authorized faculty/admin</w:t>
             </w:r>
           </w:p>
         </w:tc>
@@ -5126,7 +5423,7 @@
               <w:rPr>
                 <w:sz w:val="16"/>
               </w:rPr>
-              <w:t>Create attempt if no prior finalized attempt exists</w:t>
+              <w:t>Edit quiz subject to ownership policy</w:t>
             </w:r>
           </w:p>
         </w:tc>
@@ -5144,7 +5441,7 @@
               <w:rPr>
                 <w:sz w:val="16"/>
               </w:rPr>
-              <w:t>PATCH /api/attempts/:attemptId/answers</w:t>
+              <w:t xml:space="preserve">DELETE /api/quizzes/:quizId</w:t>
             </w:r>
           </w:p>
         </w:tc>
@@ -5160,7 +5457,7 @@
               <w:rPr>
                 <w:sz w:val="16"/>
               </w:rPr>
-              <w:t>Attempt owner</w:t>
+              <w:t xml:space="preserve">Authorized faculty/admin</w:t>
             </w:r>
           </w:p>
         </w:tc>
@@ -5176,7 +5473,7 @@
               <w:rPr>
                 <w:sz w:val="16"/>
               </w:rPr>
-              <w:t>Save answers while active and before deadline</w:t>
+              <w:t xml:space="preserve">Delete a draft quiz subject to ownership policy (FR-010)</w:t>
             </w:r>
           </w:p>
         </w:tc>
@@ -5194,7 +5491,7 @@
               <w:rPr>
                 <w:sz w:val="16"/>
               </w:rPr>
-              <w:t>POST /api/attempts/:attemptId/submit</w:t>
+              <w:t>POST /api/quizzes/:quizId/publish</w:t>
             </w:r>
           </w:p>
         </w:tc>
@@ -5210,7 +5507,7 @@
               <w:rPr>
                 <w:sz w:val="16"/>
               </w:rPr>
-              <w:t>Attempt owner</w:t>
+              <w:t>Faculty/admin</w:t>
             </w:r>
           </w:p>
         </w:tc>
@@ -5226,7 +5523,7 @@
               <w:rPr>
                 <w:sz w:val="16"/>
               </w:rPr>
-              <w:t>Finalize once and return score only</w:t>
+              <w:t>Validate and publish complete quiz</w:t>
             </w:r>
           </w:p>
         </w:tc>
@@ -5244,7 +5541,7 @@
               <w:rPr>
                 <w:sz w:val="16"/>
               </w:rPr>
-              <w:t>GET /api/me/scores</w:t>
+              <w:t xml:space="preserve">POST /api/quizzes/:quizId/unpublish</w:t>
             </w:r>
           </w:p>
         </w:tc>
@@ -5260,7 +5557,7 @@
               <w:rPr>
                 <w:sz w:val="16"/>
               </w:rPr>
-              <w:t>Student</w:t>
+              <w:t xml:space="preserve">Authorized faculty/admin</w:t>
             </w:r>
           </w:p>
         </w:tc>
@@ -5276,7 +5573,7 @@
               <w:rPr>
                 <w:sz w:val="16"/>
               </w:rPr>
-              <w:t>Return current student’s attempt history</w:t>
+              <w:t xml:space="preserve">Remove a quiz from student discovery (FR-011)</w:t>
             </w:r>
           </w:p>
         </w:tc>
@@ -5294,7 +5591,7 @@
               <w:rPr>
                 <w:sz w:val="16"/>
               </w:rPr>
-              <w:t>GET /api/quizzes/:quizId/leaderboard</w:t>
+              <w:t xml:space="preserve">POST /api/quizzes/:quizId/attempts</w:t>
             </w:r>
           </w:p>
         </w:tc>
@@ -5310,7 +5607,7 @@
               <w:rPr>
                 <w:sz w:val="16"/>
               </w:rPr>
-              <w:t>Authenticated user</w:t>
+              <w:t xml:space="preserve">Student</w:t>
             </w:r>
           </w:p>
         </w:tc>
@@ -5326,7 +5623,7 @@
               <w:rPr>
                 <w:sz w:val="16"/>
               </w:rPr>
-              <w:t>Return ranking for this quiz</w:t>
+              <w:t xml:space="preserve">Create an attempt, or return the student's active attempt; 409 if the attempt is already finalized</w:t>
             </w:r>
           </w:p>
         </w:tc>
@@ -5344,7 +5641,7 @@
               <w:rPr>
                 <w:sz w:val="16"/>
               </w:rPr>
-              <w:t>POST /api/feedback</w:t>
+              <w:t>PATCH /api/attempts/:attemptId/answers</w:t>
             </w:r>
           </w:p>
         </w:tc>
@@ -5360,7 +5657,7 @@
               <w:rPr>
                 <w:sz w:val="16"/>
               </w:rPr>
-              <w:t>Authenticated user</w:t>
+              <w:t>Attempt owner</w:t>
             </w:r>
           </w:p>
         </w:tc>
@@ -5376,7 +5673,7 @@
               <w:rPr>
                 <w:sz w:val="16"/>
               </w:rPr>
-              <w:t>Store feedback</w:t>
+              <w:t>Save answers while active and before deadline</w:t>
             </w:r>
           </w:p>
         </w:tc>
@@ -5394,6 +5691,206 @@
               <w:rPr>
                 <w:sz w:val="16"/>
               </w:rPr>
+              <w:t>POST /api/attempts/:attemptId/submit</w:t>
+            </w:r>
+          </w:p>
+        </w:tc>
+        <w:tc>
+          <w:tcPr>
+            <w:tcW w:type="dxa" w:w="3312"/>
+          </w:tcPr>
+          <w:p>
+            <w:pPr>
+              <w:spacing w:after="20"/>
+            </w:pPr>
+            <w:r>
+              <w:rPr>
+                <w:sz w:val="16"/>
+              </w:rPr>
+              <w:t>Attempt owner</w:t>
+            </w:r>
+          </w:p>
+        </w:tc>
+        <w:tc>
+          <w:tcPr>
+            <w:tcW w:type="dxa" w:w="3312"/>
+          </w:tcPr>
+          <w:p>
+            <w:pPr>
+              <w:spacing w:after="20"/>
+            </w:pPr>
+            <w:r>
+              <w:rPr>
+                <w:sz w:val="16"/>
+              </w:rPr>
+              <w:t>Finalize once and return score only</w:t>
+            </w:r>
+          </w:p>
+        </w:tc>
+      </w:tr>
+      <w:tr>
+        <w:tc>
+          <w:tcPr>
+            <w:tcW w:type="dxa" w:w="3312"/>
+          </w:tcPr>
+          <w:p>
+            <w:pPr>
+              <w:spacing w:after="20"/>
+            </w:pPr>
+            <w:r>
+              <w:rPr>
+                <w:sz w:val="16"/>
+              </w:rPr>
+              <w:t>GET /api/me/scores</w:t>
+            </w:r>
+          </w:p>
+        </w:tc>
+        <w:tc>
+          <w:tcPr>
+            <w:tcW w:type="dxa" w:w="3312"/>
+          </w:tcPr>
+          <w:p>
+            <w:pPr>
+              <w:spacing w:after="20"/>
+            </w:pPr>
+            <w:r>
+              <w:rPr>
+                <w:sz w:val="16"/>
+              </w:rPr>
+              <w:t>Student</w:t>
+            </w:r>
+          </w:p>
+        </w:tc>
+        <w:tc>
+          <w:tcPr>
+            <w:tcW w:type="dxa" w:w="3312"/>
+          </w:tcPr>
+          <w:p>
+            <w:pPr>
+              <w:spacing w:after="20"/>
+            </w:pPr>
+            <w:r>
+              <w:rPr>
+                <w:sz w:val="16"/>
+              </w:rPr>
+              <w:t>Return current student’s attempt history</w:t>
+            </w:r>
+          </w:p>
+        </w:tc>
+      </w:tr>
+      <w:tr>
+        <w:tc>
+          <w:tcPr>
+            <w:tcW w:type="dxa" w:w="3312"/>
+          </w:tcPr>
+          <w:p>
+            <w:pPr>
+              <w:spacing w:after="20"/>
+            </w:pPr>
+            <w:r>
+              <w:rPr>
+                <w:sz w:val="16"/>
+              </w:rPr>
+              <w:t>GET /api/quizzes/:quizId/leaderboard</w:t>
+            </w:r>
+          </w:p>
+        </w:tc>
+        <w:tc>
+          <w:tcPr>
+            <w:tcW w:type="dxa" w:w="3312"/>
+          </w:tcPr>
+          <w:p>
+            <w:pPr>
+              <w:spacing w:after="20"/>
+            </w:pPr>
+            <w:r>
+              <w:rPr>
+                <w:sz w:val="16"/>
+              </w:rPr>
+              <w:t>Authenticated user</w:t>
+            </w:r>
+          </w:p>
+        </w:tc>
+        <w:tc>
+          <w:tcPr>
+            <w:tcW w:type="dxa" w:w="3312"/>
+          </w:tcPr>
+          <w:p>
+            <w:pPr>
+              <w:spacing w:after="20"/>
+            </w:pPr>
+            <w:r>
+              <w:rPr>
+                <w:sz w:val="16"/>
+              </w:rPr>
+              <w:t>Return ranking for this quiz</w:t>
+            </w:r>
+          </w:p>
+        </w:tc>
+      </w:tr>
+      <w:tr>
+        <w:tc>
+          <w:tcPr>
+            <w:tcW w:type="dxa" w:w="3312"/>
+          </w:tcPr>
+          <w:p>
+            <w:pPr>
+              <w:spacing w:after="20"/>
+            </w:pPr>
+            <w:r>
+              <w:rPr>
+                <w:sz w:val="16"/>
+              </w:rPr>
+              <w:t>POST /api/feedback</w:t>
+            </w:r>
+          </w:p>
+        </w:tc>
+        <w:tc>
+          <w:tcPr>
+            <w:tcW w:type="dxa" w:w="3312"/>
+          </w:tcPr>
+          <w:p>
+            <w:pPr>
+              <w:spacing w:after="20"/>
+            </w:pPr>
+            <w:r>
+              <w:rPr>
+                <w:sz w:val="16"/>
+              </w:rPr>
+              <w:t>Authenticated user</w:t>
+            </w:r>
+          </w:p>
+        </w:tc>
+        <w:tc>
+          <w:tcPr>
+            <w:tcW w:type="dxa" w:w="3312"/>
+          </w:tcPr>
+          <w:p>
+            <w:pPr>
+              <w:spacing w:after="20"/>
+            </w:pPr>
+            <w:r>
+              <w:rPr>
+                <w:sz w:val="16"/>
+              </w:rPr>
+              <w:t>Store feedback</w:t>
+            </w:r>
+          </w:p>
+        </w:tc>
+      </w:tr>
+      <w:tr>
+        <w:tc>
+          <w:tcPr>
+            <w:tcW w:type="dxa" w:w="3312"/>
+          </w:tcPr>
+          <w:p>
+            <w:pPr>
+              <w:spacing w:after="20"/>
+            </w:pPr>
+            <w:r>
+              <w:rPr>
+                <w:sz w:val="16"/>
+              </w:rPr>
               <w:t>GET /api/admin/feedback</w:t>
             </w:r>
           </w:p>
@@ -5427,6 +5924,106 @@
                 <w:sz w:val="16"/>
               </w:rPr>
               <w:t>Review submitted feedback</w:t>
+            </w:r>
+          </w:p>
+        </w:tc>
+      </w:tr>
+      <w:tr>
+        <w:tc>
+          <w:tcPr>
+            <w:tcW w:type="dxa" w:w="3312"/>
+          </w:tcPr>
+          <w:p>
+            <w:pPr>
+              <w:spacing w:after="20"/>
+            </w:pPr>
+            <w:r>
+              <w:rPr>
+                <w:sz w:val="16"/>
+              </w:rPr>
+              <w:t xml:space="preserve">GET /api/admin/users</w:t>
+            </w:r>
+          </w:p>
+        </w:tc>
+        <w:tc>
+          <w:tcPr>
+            <w:tcW w:type="dxa" w:w="3312"/>
+          </w:tcPr>
+          <w:p>
+            <w:pPr>
+              <w:spacing w:after="20"/>
+            </w:pPr>
+            <w:r>
+              <w:rPr>
+                <w:sz w:val="16"/>
+              </w:rPr>
+              <w:t xml:space="preserve">Administrator</w:t>
+            </w:r>
+          </w:p>
+        </w:tc>
+        <w:tc>
+          <w:tcPr>
+            <w:tcW w:type="dxa" w:w="3312"/>
+          </w:tcPr>
+          <w:p>
+            <w:pPr>
+              <w:spacing w:after="20"/>
+            </w:pPr>
+            <w:r>
+              <w:rPr>
+                <w:sz w:val="16"/>
+              </w:rPr>
+              <w:t xml:space="preserve">List users and their roles for role management</w:t>
+            </w:r>
+          </w:p>
+        </w:tc>
+      </w:tr>
+      <w:tr>
+        <w:tc>
+          <w:tcPr>
+            <w:tcW w:type="dxa" w:w="3312"/>
+          </w:tcPr>
+          <w:p>
+            <w:pPr>
+              <w:spacing w:after="20"/>
+            </w:pPr>
+            <w:r>
+              <w:rPr>
+                <w:sz w:val="16"/>
+              </w:rPr>
+              <w:t xml:space="preserve">PATCH /api/admin/users/:userId/role</w:t>
+            </w:r>
+          </w:p>
+        </w:tc>
+        <w:tc>
+          <w:tcPr>
+            <w:tcW w:type="dxa" w:w="3312"/>
+          </w:tcPr>
+          <w:p>
+            <w:pPr>
+              <w:spacing w:after="20"/>
+            </w:pPr>
+            <w:r>
+              <w:rPr>
+                <w:sz w:val="16"/>
+              </w:rPr>
+              <w:t xml:space="preserve">Administrator</w:t>
+            </w:r>
+          </w:p>
+        </w:tc>
+        <w:tc>
+          <w:tcPr>
+            <w:tcW w:type="dxa" w:w="3312"/>
+          </w:tcPr>
+          <w:p>
+            <w:pPr>
+              <w:spacing w:after="20"/>
+            </w:pPr>
+            <w:r>
+              <w:rPr>
+                <w:sz w:val="16"/>
+              </w:rPr>
+              <w:t xml:space="preserve">Change a user's role (FR-026)</w:t>
             </w:r>
           </w:p>
         </w:tc>
@@ -5833,7 +6430,7 @@
               <w:rPr>
                 <w:sz w:val="16"/>
               </w:rPr>
-              <w:t>User</w:t>
+              <w:t xml:space="preserve">User</w:t>
             </w:r>
           </w:p>
         </w:tc>
@@ -5849,7 +6446,7 @@
               <w:rPr>
                 <w:sz w:val="16"/>
               </w:rPr>
-              <w:t>_id, name, email, passwordHash, role, createdAt</w:t>
+              <w:t xml:space="preserve">_id, name, email, passwordHash, role, tokenVersion, createdAt</w:t>
             </w:r>
           </w:p>
         </w:tc>
@@ -5865,7 +6462,7 @@
               <w:rPr>
                 <w:sz w:val="16"/>
               </w:rPr>
-              <w:t>Unique email; roles student/faculty/administrator; never return hash</w:t>
+              <w:t xml:space="preserve">Unique email; roles student/faculty/administrator; never return hash; tokenVersion invalidates tokens on logout</w:t>
             </w:r>
           </w:p>
         </w:tc>
@@ -5983,7 +6580,7 @@
               <w:rPr>
                 <w:sz w:val="16"/>
               </w:rPr>
-              <w:t>Attempt</w:t>
+              <w:t xml:space="preserve">Attempt</w:t>
             </w:r>
           </w:p>
         </w:tc>
@@ -5999,7 +6596,7 @@
               <w:rPr>
                 <w:sz w:val="16"/>
               </w:rPr>
-              <w:t>_id, userId, quizId, answers, score, status, startedAt, deadlineAt, submittedAt</w:t>
+              <w:t xml:space="preserve">_id, userId, quizId, answers, score, status, startedAt, deadlineAt, submittedAt</w:t>
             </w:r>
           </w:p>
         </w:tc>
@@ -6015,7 +6612,7 @@
               <w:rPr>
                 <w:sz w:val="16"/>
               </w:rPr>
-              <w:t>References User/Quiz; enforce one finalized attempt per user/quiz</w:t>
+              <w:t xml:space="preserve">References User/Quiz; unique index on (userId, quizId) enforces one attempt record per user/quiz</w:t>
             </w:r>
           </w:p>
         </w:tc>
@@ -6074,6 +6671,11 @@
     <w:p>
       <w:r>
         <w:t>Design decision: Questions are stored in a separate Question collection linked to Quiz by quizId. Index quizId for question lookup. Attempt creation must atomically enforce one attempt record per student/quiz; an active attempt can be resumed until deadline, while a finalized attempt cannot be restarted.</w:t>
+      </w:r>
+    </w:p>
+    <w:p>
+      <w:r>
+        <w:t xml:space="preserve">Session design: login issues a signed JWT containing the user ID, role and tokenVersion. Logout increments User.tokenVersion, so the authentication middleware rejects every token issued before logout (FR-003); tokens also expire after the configured lifetime.</w:t>
       </w:r>
     </w:p>
     <w:p>
@@ -6260,7 +6862,7 @@
               <w:rPr>
                 <w:sz w:val="16"/>
               </w:rPr>
-              <w:t>Question storage</w:t>
+              <w:t xml:space="preserve">Token lifetime and client storage</w:t>
             </w:r>
           </w:p>
         </w:tc>
@@ -6276,41 +6878,7 @@
               <w:rPr>
                 <w:sz w:val="16"/>
               </w:rPr>
-              <w:t>Choose embedded or separate Question collection.</w:t>
-            </w:r>
-          </w:p>
-        </w:tc>
-      </w:tr>
-      <w:tr>
-        <w:tc>
-          <w:tcPr>
-            <w:tcW w:type="dxa" w:w="4968"/>
-          </w:tcPr>
-          <w:p>
-            <w:pPr>
-              <w:spacing w:after="20"/>
-            </w:pPr>
-            <w:r>
-              <w:rPr>
-                <w:sz w:val="16"/>
-              </w:rPr>
-              <w:t>Session storage</w:t>
-            </w:r>
-          </w:p>
-        </w:tc>
-        <w:tc>
-          <w:tcPr>
-            <w:tcW w:type="dxa" w:w="4968"/>
-          </w:tcPr>
-          <w:p>
-            <w:pPr>
-              <w:spacing w:after="20"/>
-            </w:pPr>
-            <w:r>
-              <w:rPr>
-                <w:sz w:val="16"/>
-              </w:rPr>
-              <w:t>Decide token handling and expiration securely.</w:t>
+              <w:t xml:space="preserve">Agree the JWT expiry period and where the client keeps the token; document both in README.</w:t>
             </w:r>
           </w:p>
         </w:tc>
@@ -6427,9 +6995,11 @@
       <w:pPr>
         <w:pStyle w:val="Heading1"/>
       </w:pPr>
+      <w:bookmarkStart w:id="504" w:name="_Toc8104"/>
       <w:r>
         <w:t>5. Appendices</w:t>
       </w:r>
+      <w:bookmarkEnd w:id="504"/>
     </w:p>
     <w:p>
       <w:pPr>
@@ -6917,70 +7487,6 @@
         </w:tc>
       </w:tr>
     </w:tbl>
-    <w:p>
-      <w:pPr>
-        <w:pStyle w:val="Heading2"/>
-      </w:pPr>
-      <w:r>
-        <w:t>5.4 Final Review Checklist</w:t>
-      </w:r>
-    </w:p>
-    <w:p>
-      <w:pPr>
-        <w:pStyle w:val="ListBullet"/>
-      </w:pPr>
-      <w:r>
-        <w:t>☐ Replace name, student ID, course and faculty placeholders.</w:t>
-      </w:r>
-    </w:p>
-    <w:p>
-      <w:pPr>
-        <w:pStyle w:val="ListBullet"/>
-      </w:pPr>
-      <w:r>
-        <w:t>☐ Confirm design choices match the final implementation.</w:t>
-      </w:r>
-    </w:p>
-    <w:p>
-      <w:pPr>
-        <w:pStyle w:val="ListBullet"/>
-      </w:pPr>
-      <w:r>
-        <w:t>☐ Insert formal UML diagrams if required by the course.</w:t>
-      </w:r>
-    </w:p>
-    <w:p>
-      <w:pPr>
-        <w:pStyle w:val="ListBullet"/>
-      </w:pPr>
-      <w:r>
-        <w:t>☐ Verify API paths and schemas against the code.</w:t>
-      </w:r>
-    </w:p>
-    <w:p>
-      <w:pPr>
-        <w:pStyle w:val="ListBullet"/>
-      </w:pPr>
-      <w:r>
-        <w:t>☐ Check SRS IDs against the final SRS.</w:t>
-      </w:r>
-    </w:p>
-    <w:p>
-      <w:pPr>
-        <w:pStyle w:val="ListBullet"/>
-      </w:pPr>
-      <w:r>
-        <w:t>☐ Update contents and page numbering in Word.</w:t>
-      </w:r>
-    </w:p>
-    <w:p>
-      <w:pPr>
-        <w:pStyle w:val="ListBullet"/>
-      </w:pPr>
-      <w:r>
-        <w:t>☐ Ensure no credentials or private answer keys appear in the document.</w:t>
-      </w:r>
-    </w:p>
     <w:sectPr>
       <w:headerReference w:type="default" r:id="rId9"/>
       <w:footerReference w:type="default" r:id="rId10"/>
@@ -19074,6 +19580,28 @@
         <w:shd w:val="clear" w:color="auto" w:fill="FBCAA2" w:themeFill="accent6" w:themeFillTint="7F"/>
       </w:tcPr>
     </w:tblStylePr>
+  </w:style>
+  <w:style w:type="paragraph" w:customStyle="1" w:styleId="HeadingNoTOC">
+    <w:name w:val="Heading (not in contents)"/>
+    <w:basedOn w:val="Heading1"/>
+    <w:next w:val="Normal"/>
+    <w:qFormat/>
+    <w:pPr>
+      <w:outlineLvl w:val="9"/>
+    </w:pPr>
+  </w:style>
+  <w:style w:type="paragraph" w:styleId="TOC1">
+    <w:name w:val="toc 1"/>
+    <w:basedOn w:val="Normal"/>
+    <w:next w:val="Normal"/>
+    <w:uiPriority w:val="39"/>
+    <w:unhideWhenUsed/>
+    <w:pPr>
+      <w:tabs>
+        <w:tab w:val="right" w:leader="dot" w:pos="9782"/>
+      </w:tabs>
+      <w:spacing w:after="60"/>
+    </w:pPr>
   </w:style>
 </w:styles>
 </file>

</xml_diff>